<commit_message>
Fix Chapter 4 cartography fit and update text
</commit_message>
<xml_diff>
--- a/public/chapter-4/Chapitre_4_SNA_version_publiable_origine_medullaire.docx
+++ b/public/chapter-4/Chapitre_4_SNA_version_publiable_origine_medullaire.docx
@@ -1911,8 +1911,14 @@
     <w:p>
       <w:pPr>
         <w:pStyle w:val="Heading2"/>
-      </w:pPr>
-      <w:r>
+        <w:rPr>
+          <w:lang w:val="fr-FR"/>
+        </w:rPr>
+      </w:pPr>
+      <w:r>
+        <w:rPr>
+          <w:lang w:val="fr-FR"/>
+        </w:rPr>
         <w:t>5.1. Origine médullaire du sympathique</w:t>
       </w:r>
     </w:p>
@@ -1956,6 +1962,9 @@
         </w:rPr>
       </w:pPr>
       <w:r>
+        <w:rPr>
+          <w:lang w:val="fr-FR"/>
+        </w:rPr>
         <w:t>À partir de la chaîne paravertébrale, les fibres peuvent faire relais au même niveau, monter ou descendre avant de faire relais, ou traverser la chaîne sans synapse pour former des nerfs splanchniques destinés aux plexus prévertébraux. Cette organisation constitue le point de départ des voies sympathiques destinées aux territoires céphaliques, thoraciques, abdominaux et pelviens.</w:t>
       </w:r>
     </w:p>
@@ -1967,6 +1976,9 @@
         </w:rPr>
       </w:pPr>
       <w:r>
+        <w:rPr>
+          <w:lang w:val="fr-FR"/>
+        </w:rPr>
         <w:t>5.2. Organisation métamérique</w:t>
       </w:r>
     </w:p>
@@ -1991,6 +2003,9 @@
         </w:rPr>
       </w:pPr>
       <w:r>
+        <w:rPr>
+          <w:lang w:val="fr-FR"/>
+        </w:rPr>
         <w:t>5.3. Chaîne ganglionnaire thoracique</w:t>
       </w:r>
     </w:p>
@@ -2028,6 +2043,9 @@
         </w:rPr>
       </w:pPr>
       <w:r>
+        <w:rPr>
+          <w:lang w:val="fr-FR"/>
+        </w:rPr>
         <w:t>5.3.1. Rameaux méningés récurrents</w:t>
       </w:r>
     </w:p>
@@ -2093,6 +2111,9 @@
         </w:rPr>
       </w:pPr>
       <w:r>
+        <w:rPr>
+          <w:lang w:val="fr-FR"/>
+        </w:rPr>
         <w:t>5.4. Chaîne ganglionnaire cervicale</w:t>
       </w:r>
     </w:p>
@@ -2117,6 +2138,9 @@
         </w:rPr>
       </w:pPr>
       <w:r>
+        <w:rPr>
+          <w:lang w:val="fr-FR"/>
+        </w:rPr>
         <w:t>5.4.1. Ganglion cervical inférieur ou stellaire</w:t>
       </w:r>
     </w:p>
@@ -2148,6 +2172,7 @@
           <w:color w:val="B1842C"/>
           <w:lang w:val="fr-FR"/>
         </w:rPr>
+        <w:lastRenderedPageBreak/>
         <w:t xml:space="preserve">Intérêt en ROP — </w:t>
       </w:r>
       <w:r>
@@ -2165,6 +2190,9 @@
         </w:rPr>
       </w:pPr>
       <w:r>
+        <w:rPr>
+          <w:lang w:val="fr-FR"/>
+        </w:rPr>
         <w:t>5.4.2. Ganglion cervical moyen</w:t>
       </w:r>
     </w:p>
@@ -2189,6 +2217,9 @@
         </w:rPr>
       </w:pPr>
       <w:r>
+        <w:rPr>
+          <w:lang w:val="fr-FR"/>
+        </w:rPr>
         <w:t>5.4.3. Ganglion cervical supérieur</w:t>
       </w:r>
     </w:p>
@@ -2254,6 +2285,9 @@
         </w:rPr>
       </w:pPr>
       <w:r>
+        <w:rPr>
+          <w:lang w:val="fr-FR"/>
+        </w:rPr>
         <w:t>5.5. Chaîne ganglionnaire lombale</w:t>
       </w:r>
     </w:p>
@@ -2319,6 +2353,9 @@
         </w:rPr>
       </w:pPr>
       <w:r>
+        <w:rPr>
+          <w:lang w:val="fr-FR"/>
+        </w:rPr>
         <w:t>5.6. Chaîne ganglionnaire sacrale et coccygienne</w:t>
       </w:r>
     </w:p>
@@ -2384,6 +2421,9 @@
         </w:rPr>
       </w:pPr>
       <w:r>
+        <w:rPr>
+          <w:lang w:val="fr-FR"/>
+        </w:rPr>
         <w:t>5.7. Nerfs splanchniques</w:t>
       </w:r>
     </w:p>
@@ -2645,7 +2685,6 @@
         <w:rPr>
           <w:lang w:val="fr-FR"/>
         </w:rPr>
-        <w:lastRenderedPageBreak/>
         <w:t>7. Chaîne plexique prévertébrale (ou pré-aortique)</w:t>
       </w:r>
     </w:p>
@@ -3083,6 +3122,7 @@
           <w:color w:val="B1842C"/>
           <w:lang w:val="fr-FR"/>
         </w:rPr>
+        <w:lastRenderedPageBreak/>
         <w:t xml:space="preserve">Intérêt en ROP — </w:t>
       </w:r>
       <w:r>
@@ -3120,7 +3160,6 @@
         <w:rPr>
           <w:lang w:val="fr-FR"/>
         </w:rPr>
-        <w:lastRenderedPageBreak/>
         <w:t>10. Glandes surrénales</w:t>
       </w:r>
     </w:p>
@@ -3666,6 +3705,7 @@
         <w:rPr>
           <w:lang w:val="fr-FR"/>
         </w:rPr>
+        <w:lastRenderedPageBreak/>
         <w:t>11.6. Nerf vague X — étage abdominal</w:t>
       </w:r>
     </w:p>
@@ -3728,7 +3768,6 @@
           <w:sz w:val="18"/>
           <w:lang w:val="fr-FR"/>
         </w:rPr>
-        <w:lastRenderedPageBreak/>
         <w:t>Cf. Chapitres 9 — Estomac ; 10 — Duodénum ; 14 — Intestin grêle ; 15 — Côlon.</w:t>
       </w:r>
     </w:p>
@@ -4316,6 +4355,7 @@
           <w:sz w:val="18"/>
           <w:lang w:val="fr-FR"/>
         </w:rPr>
+        <w:lastRenderedPageBreak/>
         <w:t>Cf. Chapitre 14 — Intestin grêle.</w:t>
       </w:r>
     </w:p>
@@ -4360,7 +4400,6 @@
           <w:sz w:val="18"/>
           <w:lang w:val="fr-FR"/>
         </w:rPr>
-        <w:lastRenderedPageBreak/>
         <w:t>Cf. Chapitre 16 — Reins et surrénales.</w:t>
       </w:r>
     </w:p>
@@ -4456,21 +4495,6 @@
     <w:p>
       <w:pPr>
         <w:pStyle w:val="ListBullet"/>
-        <w:spacing w:after="34"/>
-        <w:rPr>
-          <w:lang w:val="fr-FR"/>
-        </w:rPr>
-      </w:pPr>
-      <w:r>
-        <w:rPr>
-          <w:lang w:val="fr-FR"/>
-        </w:rPr>
-        <w:t>Le chapitre 4 conserve l’architecture de la version originale tout en étant recentré sur le Niveau 2 : régulation neuro-végétative et adaptation.</w:t>
-      </w:r>
-    </w:p>
-    <w:p>
-      <w:pPr>
-        <w:pStyle w:val="ListBullet"/>
         <w:rPr>
           <w:lang w:val="fr-FR"/>
         </w:rPr>
@@ -4494,7 +4518,7 @@
         <w:rPr>
           <w:lang w:val="fr-FR"/>
         </w:rPr>
-        <w:t>Les références entre chapitres sont conservées afin de maintenir la continuité de lecture du livre.</w:t>
+        <w:t>Le SNA fonctionne dans les deux sens : commandes efférentes vers les viscères et informations afférentes vers les centres.</w:t>
       </w:r>
     </w:p>
     <w:p>
@@ -4509,7 +4533,7 @@
         <w:rPr>
           <w:lang w:val="fr-FR"/>
         </w:rPr>
-        <w:t>Les encadrés « Intérêt en ROP » sont maintenus aux endroits où l’anatomie ou la physiologie est mise en relation avec la pratique clinique.</w:t>
+        <w:t>Le parasympathique pelvien S2-S4 est distinct du nerf pudendal somatique S2-S4.</w:t>
       </w:r>
     </w:p>
     <w:p>
@@ -4524,36 +4548,6 @@
         <w:rPr>
           <w:lang w:val="fr-FR"/>
         </w:rPr>
-        <w:t>Le SNA fonctionne dans les deux sens : commandes efférentes vers les viscères et informations afférentes vers les centres.</w:t>
-      </w:r>
-    </w:p>
-    <w:p>
-      <w:pPr>
-        <w:pStyle w:val="ListBullet"/>
-        <w:spacing w:after="34"/>
-        <w:rPr>
-          <w:lang w:val="fr-FR"/>
-        </w:rPr>
-      </w:pPr>
-      <w:r>
-        <w:rPr>
-          <w:lang w:val="fr-FR"/>
-        </w:rPr>
-        <w:t>Le parasympathique pelvien S2-S4 est distinct du nerf pudendal somatique S2-S4.</w:t>
-      </w:r>
-    </w:p>
-    <w:p>
-      <w:pPr>
-        <w:pStyle w:val="ListBullet"/>
-        <w:spacing w:after="34"/>
-        <w:rPr>
-          <w:lang w:val="fr-FR"/>
-        </w:rPr>
-      </w:pPr>
-      <w:r>
-        <w:rPr>
-          <w:lang w:val="fr-FR"/>
-        </w:rPr>
         <w:t>Les zones réflexes ROP restent des repères cliniques et non une anatomie directe du système autonome sur le pied.</w:t>
       </w:r>
     </w:p>
@@ -4796,6 +4790,7 @@
       <w:r>
         <w:rPr>
           <w:sz w:val="17"/>
+          <w:lang w:val="fr-FR"/>
         </w:rPr>
         <w:t xml:space="preserve">8. </w:t>
       </w:r>
@@ -4803,6 +4798,7 @@
       <w:r>
         <w:rPr>
           <w:sz w:val="17"/>
+          <w:lang w:val="fr-FR"/>
         </w:rPr>
         <w:t>Tobaldini</w:t>
       </w:r>
@@ -4810,6 +4806,7 @@
       <w:r>
         <w:rPr>
           <w:sz w:val="17"/>
+          <w:lang w:val="fr-FR"/>
         </w:rPr>
         <w:t xml:space="preserve"> E, Costantino G, </w:t>
       </w:r>
@@ -4817,6 +4814,7 @@
       <w:r>
         <w:rPr>
           <w:sz w:val="17"/>
+          <w:lang w:val="fr-FR"/>
         </w:rPr>
         <w:t>Solbiati</w:t>
       </w:r>
@@ -4824,6 +4822,7 @@
       <w:r>
         <w:rPr>
           <w:sz w:val="17"/>
+          <w:lang w:val="fr-FR"/>
         </w:rPr>
         <w:t xml:space="preserve"> M, et al. </w:t>
       </w:r>
@@ -5828,6 +5827,7 @@
   <w:style w:type="character" w:default="1" w:styleId="DefaultParagraphFont">
     <w:name w:val="Default Paragraph Font"/>
     <w:uiPriority w:val="1"/>
+    <w:semiHidden/>
     <w:unhideWhenUsed/>
   </w:style>
   <w:style w:type="table" w:default="1" w:styleId="TableNormal">

</xml_diff>